<commit_message>
docs: ampliar plan estrategico con aprovisionamiento dinamico Google Drive y recomendacion de arquitectura modular
</commit_message>
<xml_diff>
--- a/apps/corpoelec-sigi-gestion-planificacion-distribucion/docs/NAC_2026_GGPD_PLAN_ESTRATEGICO_MODULO_INGESTA_CALIDAD_SIGI_V01.docx
+++ b/apps/corpoelec-sigi-gestion-planificacion-distribucion/docs/NAC_2026_GGPD_PLAN_ESTRATEGICO_MODULO_INGESTA_CALIDAD_SIGI_V01.docx
@@ -2233,7 +2233,7 @@
           <w:sz w:val="26"/>
           <w:szCs w:val="26"/>
         </w:rPr>
-        <w:t xml:space="preserve">7. PLAN DE IMPLEMENTACIÓN Y FASES DE DESARROLLO</w:t>
+        <w:t xml:space="preserve">7. ESTRATEGIA DE TRANSICIÓN Y "PUENTE INTELIGENTE" (REDIRECCIÓN ASISTIDA)</w:t>
       </w:r>
     </w:p>
     <w:p>
@@ -2249,7 +2249,388 @@
           <w:sz w:val="20"/>
           <w:szCs w:val="20"/>
         </w:rPr>
-        <w:t xml:space="preserve">Para no interferir con el inicio programado de la fase de QA de las aplicaciones existentes, el desarrollo del Módulo de Ingesta Inteligente se estructurará en cuatro (4) sprints:</w:t>
+        <w:t xml:space="preserve">Para evitar la resistencia al cambio y garantizar una adopción fluida sin fricción en los operadores estadales, la transición no se basará en un "bloqueo ciego", sino en un </w:t>
+      </w:r>
+      <w:r>
+        <w:rPr>
+          <w:rFonts w:ascii="Calibri" w:cs="Calibri" w:eastAsia="Calibri" w:hAnsi="Calibri"/>
+          <w:b/>
+          <w:bCs/>
+          <w:color w:val="002B49"/>
+          <w:sz w:val="20"/>
+          <w:szCs w:val="20"/>
+        </w:rPr>
+        <w:t xml:space="preserve">Puente Inteligente Institucional</w:t>
+      </w:r>
+      <w:r>
+        <w:rPr>
+          <w:rFonts w:ascii="Calibri" w:cs="Calibri" w:eastAsia="Calibri" w:hAnsi="Calibri"/>
+          <w:b w:val="false"/>
+          <w:bCs w:val="false"/>
+          <w:color w:val="1E293B"/>
+          <w:sz w:val="20"/>
+          <w:szCs w:val="20"/>
+        </w:rPr>
+        <w:t xml:space="preserve">:</w:t>
+      </w:r>
+    </w:p>
+    <w:p>
+      <w:pPr>
+        <w:spacing w:after="80" w:before="60"/>
+      </w:pPr>
+      <w:r>
+        <w:rPr>
+          <w:rFonts w:ascii="Calibri" w:cs="Calibri" w:eastAsia="Calibri" w:hAnsi="Calibri"/>
+          <w:b w:val="false"/>
+          <w:bCs w:val="false"/>
+          <w:color w:val="1E293B"/>
+          <w:sz w:val="20"/>
+          <w:szCs w:val="20"/>
+        </w:rPr>
+        <w:t xml:space="preserve">1. </w:t>
+      </w:r>
+      <w:r>
+        <w:rPr>
+          <w:rFonts w:ascii="Calibri" w:cs="Calibri" w:eastAsia="Calibri" w:hAnsi="Calibri"/>
+          <w:b/>
+          <w:bCs/>
+          <w:color w:val="002B49"/>
+          <w:sz w:val="20"/>
+          <w:szCs w:val="20"/>
+        </w:rPr>
+        <w:t xml:space="preserve">Banner de Redirección Asistida en Apps Satélites:</w:t>
+      </w:r>
+    </w:p>
+    <w:p>
+      <w:pPr>
+        <w:pStyle w:val="ListParagraph"/>
+        <w:numPr>
+          <w:ilvl w:val="0"/>
+          <w:numId w:val="1"/>
+        </w:numPr>
+        <w:spacing w:after="40" w:before="40"/>
+      </w:pPr>
+      <w:r>
+        <w:rPr>
+          <w:rFonts w:ascii="Calibri" w:cs="Calibri" w:eastAsia="Calibri" w:hAnsi="Calibri"/>
+          <w:b w:val="false"/>
+          <w:bCs w:val="false"/>
+          <w:color w:val="1E293B"/>
+          <w:sz w:val="20"/>
+          <w:szCs w:val="20"/>
+        </w:rPr>
+        <w:t xml:space="preserve">Al presionar "Cargar Datos" en SCTIS, SCEIN o SCPPE, la app desplegará una notificación moderna: *"La carga oficial del SEN ha sido centralizada y certificada en el SIGI bajo norma ISO 8000"*.</w:t>
+      </w:r>
+    </w:p>
+    <w:p>
+      <w:pPr>
+        <w:pStyle w:val="ListParagraph"/>
+        <w:numPr>
+          <w:ilvl w:val="0"/>
+          <w:numId w:val="1"/>
+        </w:numPr>
+        <w:spacing w:after="40" w:before="40"/>
+      </w:pPr>
+      <w:r>
+        <w:rPr>
+          <w:rFonts w:ascii="Calibri" w:cs="Calibri" w:eastAsia="Calibri" w:hAnsi="Calibri"/>
+          <w:b w:val="false"/>
+          <w:bCs w:val="false"/>
+          <w:color w:val="1E293B"/>
+          <w:sz w:val="20"/>
+          <w:szCs w:val="20"/>
+        </w:rPr>
+        <w:t xml:space="preserve">Un botón directo </w:t>
+      </w:r>
+      <w:r>
+        <w:rPr>
+          <w:rFonts w:ascii="Consolas" w:cs="Consolas" w:eastAsia="Consolas" w:hAnsi="Consolas"/>
+          <w:b w:val="false"/>
+          <w:bCs w:val="false"/>
+          <w:color w:val="0F172A"/>
+          <w:sz w:val="18"/>
+          <w:szCs w:val="18"/>
+        </w:rPr>
+        <w:t xml:space="preserve"> [Validar y Cargar en SIGI] </w:t>
+      </w:r>
+      <w:r>
+        <w:rPr>
+          <w:rFonts w:ascii="Calibri" w:cs="Calibri" w:eastAsia="Calibri" w:hAnsi="Calibri"/>
+          <w:b w:val="false"/>
+          <w:bCs w:val="false"/>
+          <w:color w:val="1E293B"/>
+          <w:sz w:val="20"/>
+          <w:szCs w:val="20"/>
+        </w:rPr>
+        <w:t xml:space="preserve"> redirige al operador mediante </w:t>
+      </w:r>
+      <w:r>
+        <w:rPr>
+          <w:rFonts w:ascii="Calibri" w:cs="Calibri" w:eastAsia="Calibri" w:hAnsi="Calibri"/>
+          <w:b/>
+          <w:bCs/>
+          <w:color w:val="002B49"/>
+          <w:sz w:val="20"/>
+          <w:szCs w:val="20"/>
+        </w:rPr>
+        <w:t xml:space="preserve">Deep-Link SSO</w:t>
+      </w:r>
+      <w:r>
+        <w:rPr>
+          <w:rFonts w:ascii="Calibri" w:cs="Calibri" w:eastAsia="Calibri" w:hAnsi="Calibri"/>
+          <w:b w:val="false"/>
+          <w:bCs w:val="false"/>
+          <w:color w:val="1E293B"/>
+          <w:sz w:val="20"/>
+          <w:szCs w:val="20"/>
+        </w:rPr>
+        <w:t xml:space="preserve">, pre-seleccionando automáticamente su estado y el proceso correspondiente sin requerir re-autenticación.</w:t>
+      </w:r>
+    </w:p>
+    <w:p>
+      <w:pPr>
+        <w:spacing w:after="80" w:before="60"/>
+      </w:pPr>
+      <w:r>
+        <w:rPr>
+          <w:rFonts w:ascii="Calibri" w:cs="Calibri" w:eastAsia="Calibri" w:hAnsi="Calibri"/>
+          <w:b w:val="false"/>
+          <w:bCs w:val="false"/>
+          <w:color w:val="1E293B"/>
+          <w:sz w:val="20"/>
+          <w:szCs w:val="20"/>
+        </w:rPr>
+        <w:t xml:space="preserve">2. </w:t>
+      </w:r>
+      <w:r>
+        <w:rPr>
+          <w:rFonts w:ascii="Calibri" w:cs="Calibri" w:eastAsia="Calibri" w:hAnsi="Calibri"/>
+          <w:b/>
+          <w:bCs/>
+          <w:color w:val="002B49"/>
+          <w:sz w:val="20"/>
+          <w:szCs w:val="20"/>
+        </w:rPr>
+        <w:t xml:space="preserve">Separación de Responsabilidades:</w:t>
+      </w:r>
+    </w:p>
+    <w:p>
+      <w:pPr>
+        <w:pStyle w:val="ListParagraph"/>
+        <w:numPr>
+          <w:ilvl w:val="0"/>
+          <w:numId w:val="1"/>
+        </w:numPr>
+        <w:spacing w:after="40" w:before="40"/>
+      </w:pPr>
+      <w:r>
+        <w:rPr>
+          <w:rFonts w:ascii="Calibri" w:cs="Calibri" w:eastAsia="Calibri" w:hAnsi="Calibri"/>
+          <w:b/>
+          <w:bCs/>
+          <w:color w:val="002B49"/>
+          <w:sz w:val="20"/>
+          <w:szCs w:val="20"/>
+        </w:rPr>
+        <w:t xml:space="preserve">SIGI:</w:t>
+      </w:r>
+      <w:r>
+        <w:rPr>
+          <w:rFonts w:ascii="Calibri" w:cs="Calibri" w:eastAsia="Calibri" w:hAnsi="Calibri"/>
+          <w:b w:val="false"/>
+          <w:bCs w:val="false"/>
+          <w:color w:val="1E293B"/>
+          <w:sz w:val="20"/>
+          <w:szCs w:val="20"/>
+        </w:rPr>
+        <w:t xml:space="preserve"> Ingesta masiva semanal/mensual, validación sintáctica ISO 8000, respaldo en Google Drive y tareas de remediación.</w:t>
+      </w:r>
+    </w:p>
+    <w:p>
+      <w:pPr>
+        <w:pStyle w:val="ListParagraph"/>
+        <w:numPr>
+          <w:ilvl w:val="0"/>
+          <w:numId w:val="1"/>
+        </w:numPr>
+        <w:spacing w:after="40" w:before="40"/>
+      </w:pPr>
+      <w:r>
+        <w:rPr>
+          <w:rFonts w:ascii="Calibri" w:cs="Calibri" w:eastAsia="Calibri" w:hAnsi="Calibri"/>
+          <w:b/>
+          <w:bCs/>
+          <w:color w:val="002B49"/>
+          <w:sz w:val="20"/>
+          <w:szCs w:val="20"/>
+        </w:rPr>
+        <w:t xml:space="preserve">Apps Satélites:</w:t>
+      </w:r>
+      <w:r>
+        <w:rPr>
+          <w:rFonts w:ascii="Calibri" w:cs="Calibri" w:eastAsia="Calibri" w:hAnsi="Calibri"/>
+          <w:b w:val="false"/>
+          <w:bCs w:val="false"/>
+          <w:color w:val="1E293B"/>
+          <w:sz w:val="20"/>
+          <w:szCs w:val="20"/>
+        </w:rPr>
+        <w:t xml:space="preserve"> Análisis de indicadores, mapas geográficos especializados y </w:t>
+      </w:r>
+      <w:r>
+        <w:rPr>
+          <w:rFonts w:ascii="Calibri" w:cs="Calibri" w:eastAsia="Calibri" w:hAnsi="Calibri"/>
+          <w:b/>
+          <w:bCs/>
+          <w:color w:val="002B49"/>
+          <w:sz w:val="20"/>
+          <w:szCs w:val="20"/>
+        </w:rPr>
+        <w:t xml:space="preserve">edición fina de registros individuales</w:t>
+      </w:r>
+      <w:r>
+        <w:rPr>
+          <w:rFonts w:ascii="Calibri" w:cs="Calibri" w:eastAsia="Calibri" w:hAnsi="Calibri"/>
+          <w:b w:val="false"/>
+          <w:bCs w:val="false"/>
+          <w:color w:val="1E293B"/>
+          <w:sz w:val="20"/>
+          <w:szCs w:val="20"/>
+        </w:rPr>
+        <w:t xml:space="preserve"> autorizados.</w:t>
+      </w:r>
+    </w:p>
+    <w:p>
+      <w:pPr>
+        <w:spacing w:after="80" w:before="60"/>
+      </w:pPr>
+      <w:r>
+        <w:rPr>
+          <w:rFonts w:ascii="Calibri" w:cs="Calibri" w:eastAsia="Calibri" w:hAnsi="Calibri"/>
+          <w:b w:val="false"/>
+          <w:bCs w:val="false"/>
+          <w:color w:val="1E293B"/>
+          <w:sz w:val="20"/>
+          <w:szCs w:val="20"/>
+        </w:rPr>
+        <w:t xml:space="preserve">3. </w:t>
+      </w:r>
+      <w:r>
+        <w:rPr>
+          <w:rFonts w:ascii="Calibri" w:cs="Calibri" w:eastAsia="Calibri" w:hAnsi="Calibri"/>
+          <w:b/>
+          <w:bCs/>
+          <w:color w:val="002B49"/>
+          <w:sz w:val="20"/>
+          <w:szCs w:val="20"/>
+        </w:rPr>
+        <w:t xml:space="preserve">Interruptor de Contingencia (*Feature Flag*):</w:t>
+      </w:r>
+    </w:p>
+    <w:p>
+      <w:pPr>
+        <w:pStyle w:val="ListParagraph"/>
+        <w:numPr>
+          <w:ilvl w:val="0"/>
+          <w:numId w:val="1"/>
+        </w:numPr>
+        <w:spacing w:after="40" w:before="40"/>
+      </w:pPr>
+      <w:r>
+        <w:rPr>
+          <w:rFonts w:ascii="Calibri" w:cs="Calibri" w:eastAsia="Calibri" w:hAnsi="Calibri"/>
+          <w:b w:val="false"/>
+          <w:bCs w:val="false"/>
+          <w:color w:val="1E293B"/>
+          <w:sz w:val="20"/>
+          <w:szCs w:val="20"/>
+        </w:rPr>
+        <w:t xml:space="preserve">Variable </w:t>
+      </w:r>
+      <w:r>
+        <w:rPr>
+          <w:rFonts w:ascii="Consolas" w:cs="Consolas" w:eastAsia="Consolas" w:hAnsi="Consolas"/>
+          <w:b w:val="false"/>
+          <w:bCs w:val="false"/>
+          <w:color w:val="0F172A"/>
+          <w:sz w:val="18"/>
+          <w:szCs w:val="18"/>
+        </w:rPr>
+        <w:t xml:space="preserve"> VITE_CENTRALIZED_INGESTION_ENABLED=true </w:t>
+      </w:r>
+      <w:r>
+        <w:rPr>
+          <w:rFonts w:ascii="Calibri" w:cs="Calibri" w:eastAsia="Calibri" w:hAnsi="Calibri"/>
+          <w:b w:val="false"/>
+          <w:bCs w:val="false"/>
+          <w:color w:val="1E293B"/>
+          <w:sz w:val="20"/>
+          <w:szCs w:val="20"/>
+        </w:rPr>
+        <w:t xml:space="preserve"> que permite a la Gerencia General habilitar la carga de emergencia local en menos de 5 segundos ante cualquier eventualidad de red.</w:t>
+      </w:r>
+    </w:p>
+    <w:p>
+      <w:pPr>
+        <w:pBdr>
+          <w:bottom w:val="single" w:color="CBD5E1" w:sz="6" w:space="1"/>
+        </w:pBdr>
+        <w:spacing w:after="120" w:before="120"/>
+      </w:pPr>
+    </w:p>
+    <w:p>
+      <w:pPr>
+        <w:pStyle w:val="Heading2"/>
+        <w:spacing w:after="100" w:before="200"/>
+      </w:pPr>
+      <w:r>
+        <w:rPr>
+          <w:rFonts w:ascii="Calibri" w:cs="Calibri" w:eastAsia="Calibri" w:hAnsi="Calibri"/>
+          <w:b/>
+          <w:bCs/>
+          <w:color w:val="004488"/>
+          <w:sz w:val="26"/>
+          <w:szCs w:val="26"/>
+        </w:rPr>
+        <w:t xml:space="preserve">8. APROVISIONAMIENTO AUTOMATIZADO DE NUEVOS PROCESOS EN GOOGLE DRIVE (DYNAMIC PROVISIONING)</w:t>
+      </w:r>
+    </w:p>
+    <w:p>
+      <w:pPr>
+        <w:spacing w:after="80" w:before="60"/>
+      </w:pPr>
+      <w:r>
+        <w:rPr>
+          <w:rFonts w:ascii="Calibri" w:cs="Calibri" w:eastAsia="Calibri" w:hAnsi="Calibri"/>
+          <w:b w:val="false"/>
+          <w:bCs w:val="false"/>
+          <w:color w:val="1E293B"/>
+          <w:sz w:val="20"/>
+          <w:szCs w:val="20"/>
+        </w:rPr>
+        <w:t xml:space="preserve">El SIGI implementará un </w:t>
+      </w:r>
+      <w:r>
+        <w:rPr>
+          <w:rFonts w:ascii="Calibri" w:cs="Calibri" w:eastAsia="Calibri" w:hAnsi="Calibri"/>
+          <w:b/>
+          <w:bCs/>
+          <w:color w:val="002B49"/>
+          <w:sz w:val="20"/>
+          <w:szCs w:val="20"/>
+        </w:rPr>
+        <w:t xml:space="preserve">Meta-Catálogo Dinámico de Procesos y Esquemas</w:t>
+      </w:r>
+      <w:r>
+        <w:rPr>
+          <w:rFonts w:ascii="Calibri" w:cs="Calibri" w:eastAsia="Calibri" w:hAnsi="Calibri"/>
+          <w:b w:val="false"/>
+          <w:bCs w:val="false"/>
+          <w:color w:val="1E293B"/>
+          <w:sz w:val="20"/>
+          <w:szCs w:val="20"/>
+        </w:rPr>
+        <w:t xml:space="preserve"> (ej. *SC de Pica y Poda*, *SC de Desmalezamiento*, *SC de Transformadores Fallados*):</w:t>
       </w:r>
     </w:p>
     <w:tbl>
@@ -2292,11 +2673,11 @@
                 <w:sz w:val="18"/>
                 <w:szCs w:val="18"/>
               </w:rPr>
-              <w:t xml:space="preserve">CRONOGRAMA DE IMPLEMENTACIÓN:
-Sprint 1: UI del Módulo de Carga en SIGI (Tarjetas por Proceso y Drag &amp; Drop)
-Sprint 2: Motor de Validación Sintáctica ISO 8000 y Generador de Excel de Remediación
-Sprint 3: Integración Bidireccional con Google Drive y Creación Automática de Tareas SCMTP
-Sprint 4: Tablero de Desempeño Estadal (OTQR) y Conectores de Consumo en Apps Satélites</w:t>
+              <w:t xml:space="preserve">graph LR
+    A[Admin registra Nuevo Proceso en SIGI ej. SCPYP] --&gt; B[Guarda JSON Schema y Reglas ISO]
+    B --&gt; C[Dispara Webhook Google Apps Script]
+    C --&gt; D[Crea carpetas 05_SCPYP en los 25 Estados en Google Drive en &lt;3 seg]
+    D --&gt; E[Renderiza automáticamente Tarjeta de Carga y Dashboards en SIGI]</w:t>
             </w:r>
           </w:p>
         </w:tc>
@@ -2306,6 +2687,250 @@
       <w:pPr>
         <w:spacing w:after="160"/>
       </w:pPr>
+    </w:p>
+    <w:p>
+      <w:pPr>
+        <w:pStyle w:val="Heading3"/>
+        <w:spacing w:after="80" w:before="160"/>
+      </w:pPr>
+      <w:r>
+        <w:rPr>
+          <w:rFonts w:ascii="Calibri" w:cs="Calibri" w:eastAsia="Calibri" w:hAnsi="Calibri"/>
+          <w:b/>
+          <w:bCs/>
+          <w:color w:val="1E293B"/>
+          <w:sz w:val="22"/>
+          <w:szCs w:val="22"/>
+        </w:rPr>
+        <w:t xml:space="preserve">Capacidades del Aprovisionamiento Dinámico:</w:t>
+      </w:r>
+    </w:p>
+    <w:p>
+      <w:pPr>
+        <w:spacing w:after="80" w:before="60"/>
+      </w:pPr>
+      <w:r>
+        <w:rPr>
+          <w:rFonts w:ascii="Calibri" w:cs="Calibri" w:eastAsia="Calibri" w:hAnsi="Calibri"/>
+          <w:b w:val="false"/>
+          <w:bCs w:val="false"/>
+          <w:color w:val="1E293B"/>
+          <w:sz w:val="20"/>
+          <w:szCs w:val="20"/>
+        </w:rPr>
+        <w:t xml:space="preserve">1. </w:t>
+      </w:r>
+      <w:r>
+        <w:rPr>
+          <w:rFonts w:ascii="Calibri" w:cs="Calibri" w:eastAsia="Calibri" w:hAnsi="Calibri"/>
+          <w:b/>
+          <w:bCs/>
+          <w:color w:val="002B49"/>
+          <w:sz w:val="20"/>
+          <w:szCs w:val="20"/>
+        </w:rPr>
+        <w:t xml:space="preserve">Creación Automática del Árbol en Google Drive:</w:t>
+      </w:r>
+      <w:r>
+        <w:rPr>
+          <w:rFonts w:ascii="Calibri" w:cs="Calibri" w:eastAsia="Calibri" w:hAnsi="Calibri"/>
+          <w:b w:val="false"/>
+          <w:bCs w:val="false"/>
+          <w:color w:val="1E293B"/>
+          <w:sz w:val="20"/>
+          <w:szCs w:val="20"/>
+        </w:rPr>
+        <w:t xml:space="preserve"> Al registrar el código de proceso (ej. </w:t>
+      </w:r>
+      <w:r>
+        <w:rPr>
+          <w:rFonts w:ascii="Consolas" w:cs="Consolas" w:eastAsia="Consolas" w:hAnsi="Consolas"/>
+          <w:b w:val="false"/>
+          <w:bCs w:val="false"/>
+          <w:color w:val="0F172A"/>
+          <w:sz w:val="18"/>
+          <w:szCs w:val="18"/>
+        </w:rPr>
+        <w:t xml:space="preserve"> SCPYP </w:t>
+      </w:r>
+      <w:r>
+        <w:rPr>
+          <w:rFonts w:ascii="Calibri" w:cs="Calibri" w:eastAsia="Calibri" w:hAnsi="Calibri"/>
+          <w:b w:val="false"/>
+          <w:bCs w:val="false"/>
+          <w:color w:val="1E293B"/>
+          <w:sz w:val="20"/>
+          <w:szCs w:val="20"/>
+        </w:rPr>
+        <w:t xml:space="preserve">), el webhook de Google Drive genera en lote las subcarpetas para los 25 estados (</w:t>
+      </w:r>
+      <w:r>
+        <w:rPr>
+          <w:rFonts w:ascii="Consolas" w:cs="Consolas" w:eastAsia="Consolas" w:hAnsi="Consolas"/>
+          <w:b w:val="false"/>
+          <w:bCs w:val="false"/>
+          <w:color w:val="0F172A"/>
+          <w:sz w:val="18"/>
+          <w:szCs w:val="18"/>
+        </w:rPr>
+        <w:t xml:space="preserve"> /01_DCA/.../05_SCPYP_PICA_Y_PODA/2026/08_AGOSTO </w:t>
+      </w:r>
+      <w:r>
+        <w:rPr>
+          <w:rFonts w:ascii="Calibri" w:cs="Calibri" w:eastAsia="Calibri" w:hAnsi="Calibri"/>
+          <w:b w:val="false"/>
+          <w:bCs w:val="false"/>
+          <w:color w:val="1E293B"/>
+          <w:sz w:val="20"/>
+          <w:szCs w:val="20"/>
+        </w:rPr>
+        <w:t xml:space="preserve">) de forma inmediata.</w:t>
+      </w:r>
+    </w:p>
+    <w:p>
+      <w:pPr>
+        <w:spacing w:after="80" w:before="60"/>
+      </w:pPr>
+      <w:r>
+        <w:rPr>
+          <w:rFonts w:ascii="Calibri" w:cs="Calibri" w:eastAsia="Calibri" w:hAnsi="Calibri"/>
+          <w:b w:val="false"/>
+          <w:bCs w:val="false"/>
+          <w:color w:val="1E293B"/>
+          <w:sz w:val="20"/>
+          <w:szCs w:val="20"/>
+        </w:rPr>
+        <w:t xml:space="preserve">2. </w:t>
+      </w:r>
+      <w:r>
+        <w:rPr>
+          <w:rFonts w:ascii="Calibri" w:cs="Calibri" w:eastAsia="Calibri" w:hAnsi="Calibri"/>
+          <w:b/>
+          <w:bCs/>
+          <w:color w:val="002B49"/>
+          <w:sz w:val="20"/>
+          <w:szCs w:val="20"/>
+        </w:rPr>
+        <w:t xml:space="preserve">Definición de Reglas de Negocio sin Código (No-Code Schemas):</w:t>
+      </w:r>
+      <w:r>
+        <w:rPr>
+          <w:rFonts w:ascii="Calibri" w:cs="Calibri" w:eastAsia="Calibri" w:hAnsi="Calibri"/>
+          <w:b w:val="false"/>
+          <w:bCs w:val="false"/>
+          <w:color w:val="1E293B"/>
+          <w:sz w:val="20"/>
+          <w:szCs w:val="20"/>
+        </w:rPr>
+        <w:t xml:space="preserve"> El administrador define en un formulario visual las columnas requeridas (ej. Kms podados, Hectáreas desmalezadas, Capacidad KVA, Serial) y el validador ISO 8000 las aplica en caliente.</w:t>
+      </w:r>
+    </w:p>
+    <w:p>
+      <w:pPr>
+        <w:spacing w:after="80" w:before="60"/>
+      </w:pPr>
+      <w:r>
+        <w:rPr>
+          <w:rFonts w:ascii="Calibri" w:cs="Calibri" w:eastAsia="Calibri" w:hAnsi="Calibri"/>
+          <w:b w:val="false"/>
+          <w:bCs w:val="false"/>
+          <w:color w:val="1E293B"/>
+          <w:sz w:val="20"/>
+          <w:szCs w:val="20"/>
+        </w:rPr>
+        <w:t xml:space="preserve">3. </w:t>
+      </w:r>
+      <w:r>
+        <w:rPr>
+          <w:rFonts w:ascii="Calibri" w:cs="Calibri" w:eastAsia="Calibri" w:hAnsi="Calibri"/>
+          <w:b/>
+          <w:bCs/>
+          <w:color w:val="002B49"/>
+          <w:sz w:val="20"/>
+          <w:szCs w:val="20"/>
+        </w:rPr>
+        <w:t xml:space="preserve">Zero-Downtime:</w:t>
+      </w:r>
+      <w:r>
+        <w:rPr>
+          <w:rFonts w:ascii="Calibri" w:cs="Calibri" w:eastAsia="Calibri" w:hAnsi="Calibri"/>
+          <w:b w:val="false"/>
+          <w:bCs w:val="false"/>
+          <w:color w:val="1E293B"/>
+          <w:sz w:val="20"/>
+          <w:szCs w:val="20"/>
+        </w:rPr>
+        <w:t xml:space="preserve"> No requiere recompilar ni redesplegar la aplicación.</w:t>
+      </w:r>
+    </w:p>
+    <w:p>
+      <w:pPr>
+        <w:pBdr>
+          <w:bottom w:val="single" w:color="CBD5E1" w:sz="6" w:space="1"/>
+        </w:pBdr>
+        <w:spacing w:after="120" w:before="120"/>
+      </w:pPr>
+    </w:p>
+    <w:p>
+      <w:pPr>
+        <w:pStyle w:val="Heading2"/>
+        <w:spacing w:after="100" w:before="200"/>
+      </w:pPr>
+      <w:r>
+        <w:rPr>
+          <w:rFonts w:ascii="Calibri" w:cs="Calibri" w:eastAsia="Calibri" w:hAnsi="Calibri"/>
+          <w:b/>
+          <w:bCs/>
+          <w:color w:val="004488"/>
+          <w:sz w:val="26"/>
+          <w:szCs w:val="26"/>
+        </w:rPr>
+        <w:t xml:space="preserve">9. RECOMENDACIÓN ARQUITECTÓNICA: ¿APPS INDEPENDIENTES O MÓDULOS EN SIGI?</w:t>
+      </w:r>
+    </w:p>
+    <w:p>
+      <w:pPr>
+        <w:pStyle w:val="Heading3"/>
+        <w:spacing w:after="80" w:before="160"/>
+      </w:pPr>
+      <w:r>
+        <w:rPr>
+          <w:rFonts w:ascii="Calibri" w:cs="Calibri" w:eastAsia="Calibri" w:hAnsi="Calibri"/>
+          <w:b/>
+          <w:bCs/>
+          <w:color w:val="1E293B"/>
+          <w:sz w:val="22"/>
+          <w:szCs w:val="22"/>
+        </w:rPr>
+        <w:t xml:space="preserve">Veredicto y Recomendación de Especialistas:</w:t>
+      </w:r>
+    </w:p>
+    <w:p>
+      <w:pPr>
+        <w:spacing w:after="80" w:before="60"/>
+      </w:pPr>
+      <w:r>
+        <w:rPr>
+          <w:rFonts w:ascii="Calibri" w:cs="Calibri" w:eastAsia="Calibri" w:hAnsi="Calibri"/>
+          <w:b/>
+          <w:bCs/>
+          <w:color w:val="002B49"/>
+          <w:sz w:val="20"/>
+          <w:szCs w:val="20"/>
+        </w:rPr>
+        <w:t xml:space="preserve">RECOMENDAMOS EL MODELO HÍBRIDO "4 COLUMNAS ESTRATÉGICAS + MÓDULOS DINÁMICOS EN SIGI"</w:t>
+      </w:r>
+      <w:r>
+        <w:rPr>
+          <w:rFonts w:ascii="Calibri" w:cs="Calibri" w:eastAsia="Calibri" w:hAnsi="Calibri"/>
+          <w:b w:val="false"/>
+          <w:bCs w:val="false"/>
+          <w:color w:val="1E293B"/>
+          <w:sz w:val="20"/>
+          <w:szCs w:val="20"/>
+        </w:rPr>
+        <w:t xml:space="preserve">.</w:t>
+      </w:r>
     </w:p>
     <w:tbl>
       <w:tblPr>
@@ -2360,7 +2985,7 @@
                 <w:sz w:val="19"/>
                 <w:szCs w:val="19"/>
               </w:rPr>
-              <w:t xml:space="preserve">Fase</w:t>
+              <w:t xml:space="preserve">Criterio</w:t>
             </w:r>
           </w:p>
         </w:tc>
@@ -2394,7 +3019,7 @@
                 <w:sz w:val="19"/>
                 <w:szCs w:val="19"/>
               </w:rPr>
-              <w:t xml:space="preserve">Entregable Principal</w:t>
+              <w:t xml:space="preserve">Opción A: Crear 1 App Separada por cada Proceso (20+ Apps)</w:t>
             </w:r>
           </w:p>
         </w:tc>
@@ -2428,7 +3053,7 @@
                 <w:sz w:val="19"/>
                 <w:szCs w:val="19"/>
               </w:rPr>
-              <w:t xml:space="preserve">Duración</w:t>
+              <w:t xml:space="preserve">Opción B: Módulos Dinámicos Nativos en SIGI (Recomendada)</w:t>
             </w:r>
           </w:p>
         </w:tc>
@@ -2468,7 +3093,7 @@
                 <w:sz w:val="20"/>
                 <w:szCs w:val="20"/>
               </w:rPr>
-              <w:t xml:space="preserve">Fase I: Interfaz &amp; Schemas</w:t>
+              <w:t xml:space="preserve">Experiencia de Usuario</w:t>
             </w:r>
           </w:p>
         </w:tc>
@@ -2502,6 +3127,699 @@
                 <w:sz w:val="20"/>
                 <w:szCs w:val="20"/>
               </w:rPr>
+              <w:t xml:space="preserve">Fragmentada ("Carnaval de URLs y Logins").</w:t>
+            </w:r>
+          </w:p>
+        </w:tc>
+        <w:tc>
+          <w:tcPr>
+            <w:tcBorders>
+              <w:top w:val="single" w:color="CBD5E1" w:sz="4"/>
+              <w:left w:val="single" w:color="CBD5E1" w:sz="4"/>
+              <w:bottom w:val="single" w:color="CBD5E1" w:sz="4"/>
+              <w:right w:val="single" w:color="CBD5E1" w:sz="4"/>
+            </w:tcBorders>
+            <w:shd w:fill="FFFFFF" w:val="clear"/>
+            <w:tcMar>
+              <w:top w:type="dxa" w:w="120"/>
+              <w:left w:type="dxa" w:w="140"/>
+              <w:bottom w:type="dxa" w:w="120"/>
+              <w:right w:type="dxa" w:w="140"/>
+            </w:tcMar>
+          </w:tcPr>
+          <w:p>
+            <w:pPr>
+              <w:spacing w:after="80" w:before="80"/>
+              <w:jc w:val="left"/>
+            </w:pPr>
+            <w:r>
+              <w:rPr>
+                <w:rFonts w:ascii="Calibri" w:cs="Calibri" w:eastAsia="Calibri" w:hAnsi="Calibri"/>
+                <w:b/>
+                <w:bCs/>
+                <w:color w:val="002B49"/>
+                <w:sz w:val="20"/>
+                <w:szCs w:val="20"/>
+              </w:rPr>
+              <w:t xml:space="preserve">Unificada:</w:t>
+            </w:r>
+            <w:r>
+              <w:rPr>
+                <w:rFonts w:ascii="Calibri" w:cs="Calibri" w:eastAsia="Calibri" w:hAnsi="Calibri"/>
+                <w:b w:val="false"/>
+                <w:bCs w:val="false"/>
+                <w:color w:val="1E293B"/>
+                <w:sz w:val="20"/>
+                <w:szCs w:val="20"/>
+              </w:rPr>
+              <w:t xml:space="preserve"> Un solo punto de acceso y control.</w:t>
+            </w:r>
+          </w:p>
+        </w:tc>
+      </w:tr>
+      <w:tr>
+        <w:trPr>
+          <w:cantSplit/>
+          <w:tblHeader w:val="false"/>
+        </w:trPr>
+        <w:tc>
+          <w:tcPr>
+            <w:tcBorders>
+              <w:top w:val="single" w:color="CBD5E1" w:sz="4"/>
+              <w:left w:val="single" w:color="CBD5E1" w:sz="4"/>
+              <w:bottom w:val="single" w:color="CBD5E1" w:sz="4"/>
+              <w:right w:val="single" w:color="CBD5E1" w:sz="4"/>
+            </w:tcBorders>
+            <w:shd w:fill="F8FAFC" w:val="clear"/>
+            <w:tcMar>
+              <w:top w:type="dxa" w:w="120"/>
+              <w:left w:type="dxa" w:w="140"/>
+              <w:bottom w:type="dxa" w:w="120"/>
+              <w:right w:type="dxa" w:w="140"/>
+            </w:tcMar>
+          </w:tcPr>
+          <w:p>
+            <w:pPr>
+              <w:spacing w:after="80" w:before="80"/>
+              <w:jc w:val="left"/>
+            </w:pPr>
+            <w:r>
+              <w:rPr>
+                <w:rFonts w:ascii="Calibri" w:cs="Calibri" w:eastAsia="Calibri" w:hAnsi="Calibri"/>
+                <w:b/>
+                <w:bCs/>
+                <w:color w:val="002B49"/>
+                <w:sz w:val="20"/>
+                <w:szCs w:val="20"/>
+              </w:rPr>
+              <w:t xml:space="preserve">Mantenimiento Técnico</w:t>
+            </w:r>
+          </w:p>
+        </w:tc>
+        <w:tc>
+          <w:tcPr>
+            <w:tcBorders>
+              <w:top w:val="single" w:color="CBD5E1" w:sz="4"/>
+              <w:left w:val="single" w:color="CBD5E1" w:sz="4"/>
+              <w:bottom w:val="single" w:color="CBD5E1" w:sz="4"/>
+              <w:right w:val="single" w:color="CBD5E1" w:sz="4"/>
+            </w:tcBorders>
+            <w:shd w:fill="F8FAFC" w:val="clear"/>
+            <w:tcMar>
+              <w:top w:type="dxa" w:w="120"/>
+              <w:left w:type="dxa" w:w="140"/>
+              <w:bottom w:type="dxa" w:w="120"/>
+              <w:right w:type="dxa" w:w="140"/>
+            </w:tcMar>
+          </w:tcPr>
+          <w:p>
+            <w:pPr>
+              <w:spacing w:after="80" w:before="80"/>
+              <w:jc w:val="left"/>
+            </w:pPr>
+            <w:r>
+              <w:rPr>
+                <w:rFonts w:ascii="Calibri" w:cs="Calibri" w:eastAsia="Calibri" w:hAnsi="Calibri"/>
+                <w:b w:val="false"/>
+                <w:bCs w:val="false"/>
+                <w:color w:val="1E293B"/>
+                <w:sz w:val="20"/>
+                <w:szCs w:val="20"/>
+              </w:rPr>
+              <w:t xml:space="preserve">Elevadísimo (20 servidores, 20 repositorios, 20 despliegues).</w:t>
+            </w:r>
+          </w:p>
+        </w:tc>
+        <w:tc>
+          <w:tcPr>
+            <w:tcBorders>
+              <w:top w:val="single" w:color="CBD5E1" w:sz="4"/>
+              <w:left w:val="single" w:color="CBD5E1" w:sz="4"/>
+              <w:bottom w:val="single" w:color="CBD5E1" w:sz="4"/>
+              <w:right w:val="single" w:color="CBD5E1" w:sz="4"/>
+            </w:tcBorders>
+            <w:shd w:fill="F8FAFC" w:val="clear"/>
+            <w:tcMar>
+              <w:top w:type="dxa" w:w="120"/>
+              <w:left w:type="dxa" w:w="140"/>
+              <w:bottom w:type="dxa" w:w="120"/>
+              <w:right w:type="dxa" w:w="140"/>
+            </w:tcMar>
+          </w:tcPr>
+          <w:p>
+            <w:pPr>
+              <w:spacing w:after="80" w:before="80"/>
+              <w:jc w:val="left"/>
+            </w:pPr>
+            <w:r>
+              <w:rPr>
+                <w:rFonts w:ascii="Calibri" w:cs="Calibri" w:eastAsia="Calibri" w:hAnsi="Calibri"/>
+                <w:b/>
+                <w:bCs/>
+                <w:color w:val="002B49"/>
+                <w:sz w:val="20"/>
+                <w:szCs w:val="20"/>
+              </w:rPr>
+              <w:t xml:space="preserve">Óptimo:</w:t>
+            </w:r>
+            <w:r>
+              <w:rPr>
+                <w:rFonts w:ascii="Calibri" w:cs="Calibri" w:eastAsia="Calibri" w:hAnsi="Calibri"/>
+                <w:b w:val="false"/>
+                <w:bCs w:val="false"/>
+                <w:color w:val="1E293B"/>
+                <w:sz w:val="20"/>
+                <w:szCs w:val="20"/>
+              </w:rPr>
+              <w:t xml:space="preserve"> Un solo núcleo con dashboards configurables.</w:t>
+            </w:r>
+          </w:p>
+        </w:tc>
+      </w:tr>
+      <w:tr>
+        <w:trPr>
+          <w:cantSplit/>
+          <w:tblHeader w:val="false"/>
+        </w:trPr>
+        <w:tc>
+          <w:tcPr>
+            <w:tcBorders>
+              <w:top w:val="single" w:color="CBD5E1" w:sz="4"/>
+              <w:left w:val="single" w:color="CBD5E1" w:sz="4"/>
+              <w:bottom w:val="single" w:color="CBD5E1" w:sz="4"/>
+              <w:right w:val="single" w:color="CBD5E1" w:sz="4"/>
+            </w:tcBorders>
+            <w:shd w:fill="FFFFFF" w:val="clear"/>
+            <w:tcMar>
+              <w:top w:type="dxa" w:w="120"/>
+              <w:left w:type="dxa" w:w="140"/>
+              <w:bottom w:type="dxa" w:w="120"/>
+              <w:right w:type="dxa" w:w="140"/>
+            </w:tcMar>
+          </w:tcPr>
+          <w:p>
+            <w:pPr>
+              <w:spacing w:after="80" w:before="80"/>
+              <w:jc w:val="left"/>
+            </w:pPr>
+            <w:r>
+              <w:rPr>
+                <w:rFonts w:ascii="Calibri" w:cs="Calibri" w:eastAsia="Calibri" w:hAnsi="Calibri"/>
+                <w:b/>
+                <w:bCs/>
+                <w:color w:val="002B49"/>
+                <w:sz w:val="20"/>
+                <w:szCs w:val="20"/>
+              </w:rPr>
+              <w:t xml:space="preserve">Velocidad de Salida (Time-to-Market)</w:t>
+            </w:r>
+          </w:p>
+        </w:tc>
+        <w:tc>
+          <w:tcPr>
+            <w:tcBorders>
+              <w:top w:val="single" w:color="CBD5E1" w:sz="4"/>
+              <w:left w:val="single" w:color="CBD5E1" w:sz="4"/>
+              <w:bottom w:val="single" w:color="CBD5E1" w:sz="4"/>
+              <w:right w:val="single" w:color="CBD5E1" w:sz="4"/>
+            </w:tcBorders>
+            <w:shd w:fill="FFFFFF" w:val="clear"/>
+            <w:tcMar>
+              <w:top w:type="dxa" w:w="120"/>
+              <w:left w:type="dxa" w:w="140"/>
+              <w:bottom w:type="dxa" w:w="120"/>
+              <w:right w:type="dxa" w:w="140"/>
+            </w:tcMar>
+          </w:tcPr>
+          <w:p>
+            <w:pPr>
+              <w:spacing w:after="80" w:before="80"/>
+              <w:jc w:val="left"/>
+            </w:pPr>
+            <w:r>
+              <w:rPr>
+                <w:rFonts w:ascii="Calibri" w:cs="Calibri" w:eastAsia="Calibri" w:hAnsi="Calibri"/>
+                <w:b w:val="false"/>
+                <w:bCs w:val="false"/>
+                <w:color w:val="1E293B"/>
+                <w:sz w:val="20"/>
+                <w:szCs w:val="20"/>
+              </w:rPr>
+              <w:t xml:space="preserve">Semanas por cada proceso nuevo.</w:t>
+            </w:r>
+          </w:p>
+        </w:tc>
+        <w:tc>
+          <w:tcPr>
+            <w:tcBorders>
+              <w:top w:val="single" w:color="CBD5E1" w:sz="4"/>
+              <w:left w:val="single" w:color="CBD5E1" w:sz="4"/>
+              <w:bottom w:val="single" w:color="CBD5E1" w:sz="4"/>
+              <w:right w:val="single" w:color="CBD5E1" w:sz="4"/>
+            </w:tcBorders>
+            <w:shd w:fill="FFFFFF" w:val="clear"/>
+            <w:tcMar>
+              <w:top w:type="dxa" w:w="120"/>
+              <w:left w:type="dxa" w:w="140"/>
+              <w:bottom w:type="dxa" w:w="120"/>
+              <w:right w:type="dxa" w:w="140"/>
+            </w:tcMar>
+          </w:tcPr>
+          <w:p>
+            <w:pPr>
+              <w:spacing w:after="80" w:before="80"/>
+              <w:jc w:val="left"/>
+            </w:pPr>
+            <w:r>
+              <w:rPr>
+                <w:rFonts w:ascii="Calibri" w:cs="Calibri" w:eastAsia="Calibri" w:hAnsi="Calibri"/>
+                <w:b/>
+                <w:bCs/>
+                <w:color w:val="002B49"/>
+                <w:sz w:val="20"/>
+                <w:szCs w:val="20"/>
+              </w:rPr>
+              <w:t xml:space="preserve">Minutos:</w:t>
+            </w:r>
+            <w:r>
+              <w:rPr>
+                <w:rFonts w:ascii="Calibri" w:cs="Calibri" w:eastAsia="Calibri" w:hAnsi="Calibri"/>
+                <w:b w:val="false"/>
+                <w:bCs w:val="false"/>
+                <w:color w:val="1E293B"/>
+                <w:sz w:val="20"/>
+                <w:szCs w:val="20"/>
+              </w:rPr>
+              <w:t xml:space="preserve"> Solo definir el esquema de datos y el proceso queda activo.</w:t>
+            </w:r>
+          </w:p>
+        </w:tc>
+      </w:tr>
+      <w:tr>
+        <w:trPr>
+          <w:cantSplit/>
+          <w:tblHeader w:val="false"/>
+        </w:trPr>
+        <w:tc>
+          <w:tcPr>
+            <w:tcBorders>
+              <w:top w:val="single" w:color="CBD5E1" w:sz="4"/>
+              <w:left w:val="single" w:color="CBD5E1" w:sz="4"/>
+              <w:bottom w:val="single" w:color="CBD5E1" w:sz="4"/>
+              <w:right w:val="single" w:color="CBD5E1" w:sz="4"/>
+            </w:tcBorders>
+            <w:shd w:fill="F8FAFC" w:val="clear"/>
+            <w:tcMar>
+              <w:top w:type="dxa" w:w="120"/>
+              <w:left w:type="dxa" w:w="140"/>
+              <w:bottom w:type="dxa" w:w="120"/>
+              <w:right w:type="dxa" w:w="140"/>
+            </w:tcMar>
+          </w:tcPr>
+          <w:p>
+            <w:pPr>
+              <w:spacing w:after="80" w:before="80"/>
+              <w:jc w:val="left"/>
+            </w:pPr>
+            <w:r>
+              <w:rPr>
+                <w:rFonts w:ascii="Calibri" w:cs="Calibri" w:eastAsia="Calibri" w:hAnsi="Calibri"/>
+                <w:b/>
+                <w:bCs/>
+                <w:color w:val="002B49"/>
+                <w:sz w:val="20"/>
+                <w:szCs w:val="20"/>
+              </w:rPr>
+              <w:t xml:space="preserve">Escalabilidad Futura</w:t>
+            </w:r>
+          </w:p>
+        </w:tc>
+        <w:tc>
+          <w:tcPr>
+            <w:tcBorders>
+              <w:top w:val="single" w:color="CBD5E1" w:sz="4"/>
+              <w:left w:val="single" w:color="CBD5E1" w:sz="4"/>
+              <w:bottom w:val="single" w:color="CBD5E1" w:sz="4"/>
+              <w:right w:val="single" w:color="CBD5E1" w:sz="4"/>
+            </w:tcBorders>
+            <w:shd w:fill="F8FAFC" w:val="clear"/>
+            <w:tcMar>
+              <w:top w:type="dxa" w:w="120"/>
+              <w:left w:type="dxa" w:w="140"/>
+              <w:bottom w:type="dxa" w:w="120"/>
+              <w:right w:type="dxa" w:w="140"/>
+            </w:tcMar>
+          </w:tcPr>
+          <w:p>
+            <w:pPr>
+              <w:spacing w:after="80" w:before="80"/>
+              <w:jc w:val="left"/>
+            </w:pPr>
+            <w:r>
+              <w:rPr>
+                <w:rFonts w:ascii="Calibri" w:cs="Calibri" w:eastAsia="Calibri" w:hAnsi="Calibri"/>
+                <w:b w:val="false"/>
+                <w:bCs w:val="false"/>
+                <w:color w:val="1E293B"/>
+                <w:sz w:val="20"/>
+                <w:szCs w:val="20"/>
+              </w:rPr>
+              <w:t xml:space="preserve">Difícil de gobernar.</w:t>
+            </w:r>
+          </w:p>
+        </w:tc>
+        <w:tc>
+          <w:tcPr>
+            <w:tcBorders>
+              <w:top w:val="single" w:color="CBD5E1" w:sz="4"/>
+              <w:left w:val="single" w:color="CBD5E1" w:sz="4"/>
+              <w:bottom w:val="single" w:color="CBD5E1" w:sz="4"/>
+              <w:right w:val="single" w:color="CBD5E1" w:sz="4"/>
+            </w:tcBorders>
+            <w:shd w:fill="F8FAFC" w:val="clear"/>
+            <w:tcMar>
+              <w:top w:type="dxa" w:w="120"/>
+              <w:left w:type="dxa" w:w="140"/>
+              <w:bottom w:type="dxa" w:w="120"/>
+              <w:right w:type="dxa" w:w="140"/>
+            </w:tcMar>
+          </w:tcPr>
+          <w:p>
+            <w:pPr>
+              <w:spacing w:after="80" w:before="80"/>
+              <w:jc w:val="left"/>
+            </w:pPr>
+            <w:r>
+              <w:rPr>
+                <w:rFonts w:ascii="Calibri" w:cs="Calibri" w:eastAsia="Calibri" w:hAnsi="Calibri"/>
+                <w:b w:val="false"/>
+                <w:bCs w:val="false"/>
+                <w:color w:val="1E293B"/>
+                <w:sz w:val="20"/>
+                <w:szCs w:val="20"/>
+              </w:rPr>
+              <w:t xml:space="preserve">Si un módulo crece y requiere simulación compleja (ej. topología GIS avanzada), se promueve a app satélite.</w:t>
+            </w:r>
+          </w:p>
+        </w:tc>
+      </w:tr>
+    </w:tbl>
+    <w:p>
+      <w:pPr>
+        <w:spacing w:after="180"/>
+      </w:pPr>
+    </w:p>
+    <w:p>
+      <w:pPr>
+        <w:pBdr>
+          <w:bottom w:val="single" w:color="CBD5E1" w:sz="6" w:space="1"/>
+        </w:pBdr>
+        <w:spacing w:after="120" w:before="120"/>
+      </w:pPr>
+    </w:p>
+    <w:p>
+      <w:pPr>
+        <w:pStyle w:val="Heading2"/>
+        <w:spacing w:after="100" w:before="200"/>
+      </w:pPr>
+      <w:r>
+        <w:rPr>
+          <w:rFonts w:ascii="Calibri" w:cs="Calibri" w:eastAsia="Calibri" w:hAnsi="Calibri"/>
+          <w:b/>
+          <w:bCs/>
+          <w:color w:val="004488"/>
+          <w:sz w:val="26"/>
+          <w:szCs w:val="26"/>
+        </w:rPr>
+        <w:t xml:space="preserve">10. PLAN DE IMPLEMENTACIÓN Y FASES DE DESARROLLO</w:t>
+      </w:r>
+    </w:p>
+    <w:p>
+      <w:pPr>
+        <w:spacing w:after="80" w:before="60"/>
+      </w:pPr>
+      <w:r>
+        <w:rPr>
+          <w:rFonts w:ascii="Calibri" w:cs="Calibri" w:eastAsia="Calibri" w:hAnsi="Calibri"/>
+          <w:b w:val="false"/>
+          <w:bCs w:val="false"/>
+          <w:color w:val="1E293B"/>
+          <w:sz w:val="20"/>
+          <w:szCs w:val="20"/>
+        </w:rPr>
+        <w:t xml:space="preserve">Para no interferir con el inicio programado de la fase de QA de las aplicaciones existentes, el desarrollo del Módulo de Ingesta Inteligente se estructurará en cuatro (4) sprints:</w:t>
+      </w:r>
+    </w:p>
+    <w:tbl>
+      <w:tblPr>
+        <w:tblW w:type="pct" w:w="100%"/>
+        <w:tblBorders>
+          <w:top w:val="single" w:color="auto" w:sz="4"/>
+          <w:left w:val="single" w:color="auto" w:sz="4"/>
+          <w:bottom w:val="single" w:color="auto" w:sz="4"/>
+          <w:right w:val="single" w:color="auto" w:sz="4"/>
+          <w:insideH w:val="single" w:color="auto" w:sz="4"/>
+          <w:insideV w:val="single" w:color="auto" w:sz="4"/>
+        </w:tblBorders>
+      </w:tblPr>
+      <w:tblGrid>
+        <w:gridCol w:w="100"/>
+      </w:tblGrid>
+      <w:tr>
+        <w:tc>
+          <w:tcPr>
+            <w:tcBorders>
+              <w:top w:val="single" w:color="00F2FE" w:sz="4"/>
+              <w:left w:val="single" w:color="00F2FE" w:sz="16"/>
+              <w:bottom w:val="single" w:color="00F2FE" w:sz="4"/>
+              <w:right w:val="single" w:color="00F2FE" w:sz="4"/>
+            </w:tcBorders>
+            <w:shd w:fill="0F172A" w:val="clear"/>
+            <w:tcMar>
+              <w:top w:type="dxa" w:w="120"/>
+              <w:left w:type="dxa" w:w="160"/>
+              <w:bottom w:type="dxa" w:w="120"/>
+              <w:right w:type="dxa" w:w="160"/>
+            </w:tcMar>
+          </w:tcPr>
+          <w:p>
+            <w:r>
+              <w:rPr>
+                <w:rFonts w:ascii="Consolas" w:cs="Consolas" w:eastAsia="Consolas" w:hAnsi="Consolas"/>
+                <w:color w:val="E2E8F0"/>
+                <w:sz w:val="18"/>
+                <w:szCs w:val="18"/>
+              </w:rPr>
+              <w:t xml:space="preserve">CRONOGRAMA DE IMPLEMENTACIÓN:
+Sprint 1: UI del Módulo de Carga en SIGI (Tarjetas por Proceso y Drag &amp; Drop)
+Sprint 2: Motor de Validación Sintáctica ISO 8000 y Generador de Excel de Remediación
+Sprint 3: Integración Google Apps Script (Árbol 25 Estados) y Webhook de Tareas SCMTP
+Sprint 4: Aprovisionamiento Dinámico de Nuevos Procesos y Puentes Inteligentes en Apps Satélites</w:t>
+            </w:r>
+          </w:p>
+        </w:tc>
+      </w:tr>
+    </w:tbl>
+    <w:p>
+      <w:pPr>
+        <w:spacing w:after="160"/>
+      </w:pPr>
+    </w:p>
+    <w:tbl>
+      <w:tblPr>
+        <w:tblW w:type="pct" w:w="100%"/>
+        <w:tblBorders>
+          <w:top w:val="single" w:color="auto" w:sz="4"/>
+          <w:left w:val="single" w:color="auto" w:sz="4"/>
+          <w:bottom w:val="single" w:color="auto" w:sz="4"/>
+          <w:right w:val="single" w:color="auto" w:sz="4"/>
+          <w:insideH w:val="single" w:color="auto" w:sz="4"/>
+          <w:insideV w:val="single" w:color="auto" w:sz="4"/>
+        </w:tblBorders>
+        <w:tblLayout w:type="autofit"/>
+      </w:tblPr>
+      <w:tblGrid>
+        <w:gridCol w:w="100"/>
+        <w:gridCol w:w="100"/>
+        <w:gridCol w:w="100"/>
+      </w:tblGrid>
+      <w:tr>
+        <w:trPr>
+          <w:cantSplit/>
+          <w:tblHeader/>
+        </w:trPr>
+        <w:tc>
+          <w:tcPr>
+            <w:tcBorders>
+              <w:top w:val="single" w:color="CBD5E1" w:sz="4"/>
+              <w:left w:val="single" w:color="CBD5E1" w:sz="4"/>
+              <w:bottom w:val="single" w:color="CBD5E1" w:sz="4"/>
+              <w:right w:val="single" w:color="CBD5E1" w:sz="4"/>
+            </w:tcBorders>
+            <w:shd w:fill="002B49" w:val="clear"/>
+            <w:tcMar>
+              <w:top w:type="dxa" w:w="120"/>
+              <w:left w:type="dxa" w:w="140"/>
+              <w:bottom w:type="dxa" w:w="120"/>
+              <w:right w:type="dxa" w:w="140"/>
+            </w:tcMar>
+          </w:tcPr>
+          <w:p>
+            <w:pPr>
+              <w:spacing w:after="80" w:before="80"/>
+              <w:jc w:val="left"/>
+            </w:pPr>
+            <w:r>
+              <w:rPr>
+                <w:rFonts w:ascii="Calibri" w:cs="Calibri" w:eastAsia="Calibri" w:hAnsi="Calibri"/>
+                <w:b/>
+                <w:bCs/>
+                <w:color w:val="FFFFFF"/>
+                <w:sz w:val="19"/>
+                <w:szCs w:val="19"/>
+              </w:rPr>
+              <w:t xml:space="preserve">Fase</w:t>
+            </w:r>
+          </w:p>
+        </w:tc>
+        <w:tc>
+          <w:tcPr>
+            <w:tcBorders>
+              <w:top w:val="single" w:color="CBD5E1" w:sz="4"/>
+              <w:left w:val="single" w:color="CBD5E1" w:sz="4"/>
+              <w:bottom w:val="single" w:color="CBD5E1" w:sz="4"/>
+              <w:right w:val="single" w:color="CBD5E1" w:sz="4"/>
+            </w:tcBorders>
+            <w:shd w:fill="002B49" w:val="clear"/>
+            <w:tcMar>
+              <w:top w:type="dxa" w:w="120"/>
+              <w:left w:type="dxa" w:w="140"/>
+              <w:bottom w:type="dxa" w:w="120"/>
+              <w:right w:type="dxa" w:w="140"/>
+            </w:tcMar>
+          </w:tcPr>
+          <w:p>
+            <w:pPr>
+              <w:spacing w:after="80" w:before="80"/>
+              <w:jc w:val="left"/>
+            </w:pPr>
+            <w:r>
+              <w:rPr>
+                <w:rFonts w:ascii="Calibri" w:cs="Calibri" w:eastAsia="Calibri" w:hAnsi="Calibri"/>
+                <w:b/>
+                <w:bCs/>
+                <w:color w:val="FFFFFF"/>
+                <w:sz w:val="19"/>
+                <w:szCs w:val="19"/>
+              </w:rPr>
+              <w:t xml:space="preserve">Entregable Principal</w:t>
+            </w:r>
+          </w:p>
+        </w:tc>
+        <w:tc>
+          <w:tcPr>
+            <w:tcBorders>
+              <w:top w:val="single" w:color="CBD5E1" w:sz="4"/>
+              <w:left w:val="single" w:color="CBD5E1" w:sz="4"/>
+              <w:bottom w:val="single" w:color="CBD5E1" w:sz="4"/>
+              <w:right w:val="single" w:color="CBD5E1" w:sz="4"/>
+            </w:tcBorders>
+            <w:shd w:fill="002B49" w:val="clear"/>
+            <w:tcMar>
+              <w:top w:type="dxa" w:w="120"/>
+              <w:left w:type="dxa" w:w="140"/>
+              <w:bottom w:type="dxa" w:w="120"/>
+              <w:right w:type="dxa" w:w="140"/>
+            </w:tcMar>
+          </w:tcPr>
+          <w:p>
+            <w:pPr>
+              <w:spacing w:after="80" w:before="80"/>
+              <w:jc w:val="left"/>
+            </w:pPr>
+            <w:r>
+              <w:rPr>
+                <w:rFonts w:ascii="Calibri" w:cs="Calibri" w:eastAsia="Calibri" w:hAnsi="Calibri"/>
+                <w:b/>
+                <w:bCs/>
+                <w:color w:val="FFFFFF"/>
+                <w:sz w:val="19"/>
+                <w:szCs w:val="19"/>
+              </w:rPr>
+              <w:t xml:space="preserve">Duración</w:t>
+            </w:r>
+          </w:p>
+        </w:tc>
+      </w:tr>
+      <w:tr>
+        <w:trPr>
+          <w:cantSplit/>
+          <w:tblHeader w:val="false"/>
+        </w:trPr>
+        <w:tc>
+          <w:tcPr>
+            <w:tcBorders>
+              <w:top w:val="single" w:color="CBD5E1" w:sz="4"/>
+              <w:left w:val="single" w:color="CBD5E1" w:sz="4"/>
+              <w:bottom w:val="single" w:color="CBD5E1" w:sz="4"/>
+              <w:right w:val="single" w:color="CBD5E1" w:sz="4"/>
+            </w:tcBorders>
+            <w:shd w:fill="FFFFFF" w:val="clear"/>
+            <w:tcMar>
+              <w:top w:type="dxa" w:w="120"/>
+              <w:left w:type="dxa" w:w="140"/>
+              <w:bottom w:type="dxa" w:w="120"/>
+              <w:right w:type="dxa" w:w="140"/>
+            </w:tcMar>
+          </w:tcPr>
+          <w:p>
+            <w:pPr>
+              <w:spacing w:after="80" w:before="80"/>
+              <w:jc w:val="left"/>
+            </w:pPr>
+            <w:r>
+              <w:rPr>
+                <w:rFonts w:ascii="Calibri" w:cs="Calibri" w:eastAsia="Calibri" w:hAnsi="Calibri"/>
+                <w:b/>
+                <w:bCs/>
+                <w:color w:val="002B49"/>
+                <w:sz w:val="20"/>
+                <w:szCs w:val="20"/>
+              </w:rPr>
+              <w:t xml:space="preserve">Fase I: Interfaz &amp; Schemas</w:t>
+            </w:r>
+          </w:p>
+        </w:tc>
+        <w:tc>
+          <w:tcPr>
+            <w:tcBorders>
+              <w:top w:val="single" w:color="CBD5E1" w:sz="4"/>
+              <w:left w:val="single" w:color="CBD5E1" w:sz="4"/>
+              <w:bottom w:val="single" w:color="CBD5E1" w:sz="4"/>
+              <w:right w:val="single" w:color="CBD5E1" w:sz="4"/>
+            </w:tcBorders>
+            <w:shd w:fill="FFFFFF" w:val="clear"/>
+            <w:tcMar>
+              <w:top w:type="dxa" w:w="120"/>
+              <w:left w:type="dxa" w:w="140"/>
+              <w:bottom w:type="dxa" w:w="120"/>
+              <w:right w:type="dxa" w:w="140"/>
+            </w:tcMar>
+          </w:tcPr>
+          <w:p>
+            <w:pPr>
+              <w:spacing w:after="80" w:before="80"/>
+              <w:jc w:val="left"/>
+            </w:pPr>
+            <w:r>
+              <w:rPr>
+                <w:rFonts w:ascii="Calibri" w:cs="Calibri" w:eastAsia="Calibri" w:hAnsi="Calibri"/>
+                <w:b w:val="false"/>
+                <w:bCs w:val="false"/>
+                <w:color w:val="1E293B"/>
+                <w:sz w:val="20"/>
+                <w:szCs w:val="20"/>
+              </w:rPr>
               <w:t xml:space="preserve">Componente </w:t>
             </w:r>
             <w:r>
@@ -2814,7 +4132,7 @@
                 <w:sz w:val="20"/>
                 <w:szCs w:val="20"/>
               </w:rPr>
-              <w:t xml:space="preserve">Fase IV: Auditoría &amp; Telemetría</w:t>
+              <w:t xml:space="preserve">Fase IV: Aprovisionamiento &amp; Puentes</w:t>
             </w:r>
           </w:p>
         </w:tc>
@@ -2848,7 +4166,7 @@
                 <w:sz w:val="20"/>
                 <w:szCs w:val="20"/>
               </w:rPr>
-              <w:t xml:space="preserve">Matriz de cumplimiento en vivo y consumo desde SCTIS, SCEIN, SCPPE.</w:t>
+              <w:t xml:space="preserve">Constructor de Nuevos Procesos + Banners de Redirección Inteligente en SCTIS/SCEIN/SCPPE.</w:t>
             </w:r>
           </w:p>
         </w:tc>
@@ -2915,7 +4233,7 @@
           <w:sz w:val="26"/>
           <w:szCs w:val="26"/>
         </w:rPr>
-        <w:t xml:space="preserve">8. CONCLUSIÓN Y RECOMENDACIÓN</w:t>
+        <w:t xml:space="preserve">11. CONCLUSIÓN Y RECOMENDACIÓN</w:t>
       </w:r>
     </w:p>
     <w:p>

</xml_diff>